<commit_message>
New category and status can be added from the admin site
</commit_message>
<xml_diff>
--- a/static/WORK ORDER REQUEST.docx
+++ b/static/WORK ORDER REQUEST.docx
@@ -614,16 +614,16 @@
         <mc:AlternateContent>
           <mc:Choice Requires="wps">
             <w:drawing>
-              <wp:anchor distT="45720" distB="45720" distL="114300" distR="114300" simplePos="0" relativeHeight="251703296" behindDoc="1" locked="0" layoutInCell="1" allowOverlap="1" wp14:anchorId="1A6467E7" wp14:editId="6569E499">
+              <wp:anchor distT="45720" distB="45720" distL="114300" distR="114300" simplePos="0" relativeHeight="251703296" behindDoc="1" locked="0" layoutInCell="1" allowOverlap="1" wp14:anchorId="1A6467E7" wp14:editId="5F764C8D">
                 <wp:simplePos x="0" y="0"/>
                 <wp:positionH relativeFrom="column">
-                  <wp:posOffset>-57150</wp:posOffset>
+                  <wp:posOffset>-63062</wp:posOffset>
                 </wp:positionH>
                 <wp:positionV relativeFrom="paragraph">
-                  <wp:posOffset>212090</wp:posOffset>
+                  <wp:posOffset>210448</wp:posOffset>
                 </wp:positionV>
-                <wp:extent cx="5991225" cy="914400"/>
-                <wp:effectExtent l="0" t="0" r="9525" b="0"/>
+                <wp:extent cx="5864772" cy="914400"/>
+                <wp:effectExtent l="0" t="0" r="3175" b="0"/>
                 <wp:wrapNone/>
                 <wp:docPr id="217" name="Text Box 2"/>
                 <wp:cNvGraphicFramePr>
@@ -638,7 +638,7 @@
                       <wps:spPr bwMode="auto">
                         <a:xfrm>
                           <a:off x="0" y="0"/>
-                          <a:ext cx="5991225" cy="914400"/>
+                          <a:ext cx="5864772" cy="914400"/>
                         </a:xfrm>
                         <a:prstGeom prst="rect">
                           <a:avLst/>
@@ -729,7 +729,7 @@
                 <v:stroke joinstyle="miter"/>
                 <v:path gradientshapeok="t" o:connecttype="rect"/>
               </v:shapetype>
-              <v:shape id="Text Box 2" o:spid="_x0000_s1026" type="#_x0000_t202" style="position:absolute;margin-left:-4.5pt;margin-top:16.7pt;width:471.75pt;height:1in;z-index:-251613184;visibility:visible;mso-wrap-style:square;mso-width-percent:0;mso-height-percent:0;mso-wrap-distance-left:9pt;mso-wrap-distance-top:3.6pt;mso-wrap-distance-right:9pt;mso-wrap-distance-bottom:3.6pt;mso-position-horizontal:absolute;mso-position-horizontal-relative:text;mso-position-vertical:absolute;mso-position-vertical-relative:text;mso-width-percent:0;mso-height-percent:0;mso-width-relative:margin;mso-height-relative:margin;v-text-anchor:top" o:gfxdata="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" stroked="f">
+              <v:shape id="Text Box 2" o:spid="_x0000_s1026" type="#_x0000_t202" style="position:absolute;margin-left:-4.95pt;margin-top:16.55pt;width:461.8pt;height:1in;z-index:-251613184;visibility:visible;mso-wrap-style:square;mso-width-percent:0;mso-height-percent:0;mso-wrap-distance-left:9pt;mso-wrap-distance-top:3.6pt;mso-wrap-distance-right:9pt;mso-wrap-distance-bottom:3.6pt;mso-position-horizontal:absolute;mso-position-horizontal-relative:text;mso-position-vertical:absolute;mso-position-vertical-relative:text;mso-width-percent:0;mso-height-percent:0;mso-width-relative:margin;mso-height-relative:margin;v-text-anchor:top" o:gfxdata="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" stroked="f">
                 <v:textbox>
                   <w:txbxContent>
                     <w:p>
@@ -817,15 +817,15 @@
         <mc:AlternateContent>
           <mc:Choice Requires="wps">
             <w:drawing>
-              <wp:anchor distT="0" distB="0" distL="114300" distR="114300" simplePos="0" relativeHeight="251705344" behindDoc="0" locked="0" layoutInCell="1" allowOverlap="1" wp14:anchorId="3254CD88" wp14:editId="40FD67F9">
+              <wp:anchor distT="0" distB="0" distL="114300" distR="114300" simplePos="0" relativeHeight="251705344" behindDoc="0" locked="0" layoutInCell="1" allowOverlap="1" wp14:anchorId="3254CD88" wp14:editId="261B6AB5">
                 <wp:simplePos x="0" y="0"/>
                 <wp:positionH relativeFrom="column">
-                  <wp:posOffset>0</wp:posOffset>
+                  <wp:posOffset>1</wp:posOffset>
                 </wp:positionH>
                 <wp:positionV relativeFrom="page">
-                  <wp:posOffset>3209925</wp:posOffset>
+                  <wp:posOffset>3209026</wp:posOffset>
                 </wp:positionV>
-                <wp:extent cx="5934075" cy="0"/>
+                <wp:extent cx="5691972" cy="0"/>
                 <wp:effectExtent l="0" t="0" r="0" b="0"/>
                 <wp:wrapNone/>
                 <wp:docPr id="2053266494" name="Straight Connector 2"/>
@@ -837,7 +837,7 @@
                       <wps:spPr>
                         <a:xfrm>
                           <a:off x="0" y="0"/>
-                          <a:ext cx="5934075" cy="0"/>
+                          <a:ext cx="5691972" cy="0"/>
                         </a:xfrm>
                         <a:prstGeom prst="line">
                           <a:avLst/>
@@ -873,7 +873,7 @@
           </mc:Choice>
           <mc:Fallback>
             <w:pict>
-              <v:line w14:anchorId="3B556284" id="Straight Connector 2" o:spid="_x0000_s1026" style="position:absolute;z-index:251705344;visibility:visible;mso-wrap-style:square;mso-width-percent:0;mso-height-percent:0;mso-wrap-distance-left:9pt;mso-wrap-distance-top:0;mso-wrap-distance-right:9pt;mso-wrap-distance-bottom:0;mso-position-horizontal:absolute;mso-position-horizontal-relative:text;mso-position-vertical:absolute;mso-position-vertical-relative:page;mso-width-percent:0;mso-height-percent:0;mso-width-relative:margin;mso-height-relative:margin" from="0,252.75pt" to="467.25pt,252.75pt" o:gfxdata="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" strokecolor="black [3200]" strokeweight="1pt">
+              <v:line w14:anchorId="06F9094C" id="Straight Connector 2" o:spid="_x0000_s1026" style="position:absolute;z-index:251705344;visibility:visible;mso-wrap-style:square;mso-width-percent:0;mso-height-percent:0;mso-wrap-distance-left:9pt;mso-wrap-distance-top:0;mso-wrap-distance-right:9pt;mso-wrap-distance-bottom:0;mso-position-horizontal:absolute;mso-position-horizontal-relative:text;mso-position-vertical:absolute;mso-position-vertical-relative:page;mso-width-percent:0;mso-height-percent:0;mso-width-relative:margin;mso-height-relative:margin" from="0,252.7pt" to="448.2pt,252.7pt" o:gfxdata="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" strokecolor="black [3200]" strokeweight="1pt">
                 <v:stroke joinstyle="miter"/>
                 <w10:wrap anchory="page"/>
               </v:line>
@@ -884,6 +884,39 @@
       <w:r>
         <w:rPr>
           <w:rFonts w:ascii="Arial" w:hAnsi="Arial" w:cs="Arial"/>
+        </w:rPr>
+        <w:tab/>
+      </w:r>
+      <w:r>
+        <w:rPr>
+          <w:rFonts w:ascii="Arial" w:hAnsi="Arial" w:cs="Arial"/>
+        </w:rPr>
+        <w:tab/>
+      </w:r>
+      <w:r>
+        <w:rPr>
+          <w:rFonts w:ascii="Arial" w:hAnsi="Arial" w:cs="Arial"/>
+        </w:rPr>
+        <w:tab/>
+      </w:r>
+      <w:r>
+        <w:rPr>
+          <w:rFonts w:ascii="Arial" w:hAnsi="Arial" w:cs="Arial"/>
+        </w:rPr>
+        <w:tab/>
+      </w:r>
+    </w:p>
+    <w:p>
+      <w:pPr>
+        <w:spacing w:after="0" w:line="276" w:lineRule="auto"/>
+        <w:jc w:val="both"/>
+        <w:rPr>
+          <w:rFonts w:ascii="Arial" w:hAnsi="Arial" w:cs="Arial"/>
+        </w:rPr>
+      </w:pPr>
+      <w:r>
+        <w:rPr>
+          <w:rFonts w:ascii="Arial" w:hAnsi="Arial" w:cs="Arial"/>
           <w:b/>
           <w:bCs/>
           <w:noProof/>
@@ -891,15 +924,15 @@
         <mc:AlternateContent>
           <mc:Choice Requires="wps">
             <w:drawing>
-              <wp:anchor distT="0" distB="0" distL="114300" distR="114300" simplePos="0" relativeHeight="251684864" behindDoc="0" locked="0" layoutInCell="1" allowOverlap="1" wp14:anchorId="4854301E" wp14:editId="60B85E5F">
+              <wp:anchor distT="0" distB="0" distL="114300" distR="114300" simplePos="0" relativeHeight="251684864" behindDoc="0" locked="0" layoutInCell="1" allowOverlap="1" wp14:anchorId="4854301E" wp14:editId="7A57C2C0">
                 <wp:simplePos x="0" y="0"/>
                 <wp:positionH relativeFrom="column">
                   <wp:posOffset>0</wp:posOffset>
                 </wp:positionH>
                 <wp:positionV relativeFrom="page">
-                  <wp:posOffset>3419475</wp:posOffset>
+                  <wp:posOffset>3416060</wp:posOffset>
                 </wp:positionV>
-                <wp:extent cx="5934075" cy="0"/>
+                <wp:extent cx="5691505" cy="0"/>
                 <wp:effectExtent l="0" t="0" r="0" b="0"/>
                 <wp:wrapNone/>
                 <wp:docPr id="1622100066" name="Straight Connector 2"/>
@@ -911,7 +944,7 @@
                       <wps:spPr>
                         <a:xfrm>
                           <a:off x="0" y="0"/>
-                          <a:ext cx="5934075" cy="0"/>
+                          <a:ext cx="5691505" cy="0"/>
                         </a:xfrm>
                         <a:prstGeom prst="line">
                           <a:avLst/>
@@ -947,7 +980,7 @@
           </mc:Choice>
           <mc:Fallback>
             <w:pict>
-              <v:line w14:anchorId="132D4CC9" id="Straight Connector 2" o:spid="_x0000_s1026" style="position:absolute;z-index:251684864;visibility:visible;mso-wrap-style:square;mso-width-percent:0;mso-height-percent:0;mso-wrap-distance-left:9pt;mso-wrap-distance-top:0;mso-wrap-distance-right:9pt;mso-wrap-distance-bottom:0;mso-position-horizontal:absolute;mso-position-horizontal-relative:text;mso-position-vertical:absolute;mso-position-vertical-relative:page;mso-width-percent:0;mso-height-percent:0;mso-width-relative:margin;mso-height-relative:margin" from="0,269.25pt" to="467.25pt,269.25pt" o:gfxdata="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" strokecolor="black [3200]" strokeweight="1pt">
+              <v:line w14:anchorId="6A083A79" id="Straight Connector 2" o:spid="_x0000_s1026" style="position:absolute;z-index:251684864;visibility:visible;mso-wrap-style:square;mso-width-percent:0;mso-height-percent:0;mso-wrap-distance-left:9pt;mso-wrap-distance-top:0;mso-wrap-distance-right:9pt;mso-wrap-distance-bottom:0;mso-position-horizontal:absolute;mso-position-horizontal-relative:text;mso-position-vertical:absolute;mso-position-vertical-relative:page;mso-width-percent:0;mso-height-percent:0;mso-width-relative:margin;mso-height-relative:margin" from="0,269pt" to="448.15pt,269pt" o:gfxdata="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" strokecolor="black [3200]" strokeweight="1pt">
                 <v:stroke joinstyle="miter"/>
                 <w10:wrap anchory="page"/>
               </v:line>
@@ -967,18 +1000,6 @@
         </w:rPr>
         <w:tab/>
       </w:r>
-      <w:r>
-        <w:rPr>
-          <w:rFonts w:ascii="Arial" w:hAnsi="Arial" w:cs="Arial"/>
-        </w:rPr>
-        <w:tab/>
-      </w:r>
-      <w:r>
-        <w:rPr>
-          <w:rFonts w:ascii="Arial" w:hAnsi="Arial" w:cs="Arial"/>
-        </w:rPr>
-        <w:tab/>
-      </w:r>
     </w:p>
     <w:p>
       <w:pPr>
@@ -991,27 +1012,6 @@
       <w:r>
         <w:rPr>
           <w:rFonts w:ascii="Arial" w:hAnsi="Arial" w:cs="Arial"/>
-        </w:rPr>
-        <w:tab/>
-      </w:r>
-      <w:r>
-        <w:rPr>
-          <w:rFonts w:ascii="Arial" w:hAnsi="Arial" w:cs="Arial"/>
-        </w:rPr>
-        <w:tab/>
-      </w:r>
-    </w:p>
-    <w:p>
-      <w:pPr>
-        <w:spacing w:after="0" w:line="276" w:lineRule="auto"/>
-        <w:jc w:val="both"/>
-        <w:rPr>
-          <w:rFonts w:ascii="Arial" w:hAnsi="Arial" w:cs="Arial"/>
-        </w:rPr>
-      </w:pPr>
-      <w:r>
-        <w:rPr>
-          <w:rFonts w:ascii="Arial" w:hAnsi="Arial" w:cs="Arial"/>
           <w:b/>
           <w:bCs/>
           <w:noProof/>
@@ -1019,15 +1019,15 @@
         <mc:AlternateContent>
           <mc:Choice Requires="wps">
             <w:drawing>
-              <wp:anchor distT="0" distB="0" distL="114300" distR="114300" simplePos="0" relativeHeight="251695104" behindDoc="0" locked="0" layoutInCell="1" allowOverlap="1" wp14:anchorId="19CA9020" wp14:editId="6FE84144">
+              <wp:anchor distT="0" distB="0" distL="114300" distR="114300" simplePos="0" relativeHeight="251695104" behindDoc="0" locked="0" layoutInCell="1" allowOverlap="1" wp14:anchorId="19CA9020" wp14:editId="3FB81C7F">
                 <wp:simplePos x="0" y="0"/>
                 <wp:positionH relativeFrom="column">
                   <wp:posOffset>0</wp:posOffset>
                 </wp:positionH>
                 <wp:positionV relativeFrom="page">
-                  <wp:posOffset>3619500</wp:posOffset>
+                  <wp:posOffset>3623094</wp:posOffset>
                 </wp:positionV>
-                <wp:extent cx="5924550" cy="0"/>
+                <wp:extent cx="5691972" cy="0"/>
                 <wp:effectExtent l="0" t="0" r="0" b="0"/>
                 <wp:wrapNone/>
                 <wp:docPr id="354823591" name="Straight Connector 2"/>
@@ -1039,7 +1039,7 @@
                       <wps:spPr>
                         <a:xfrm>
                           <a:off x="0" y="0"/>
-                          <a:ext cx="5924550" cy="0"/>
+                          <a:ext cx="5691972" cy="0"/>
                         </a:xfrm>
                         <a:prstGeom prst="line">
                           <a:avLst/>
@@ -1075,7 +1075,7 @@
           </mc:Choice>
           <mc:Fallback>
             <w:pict>
-              <v:line w14:anchorId="0704368B" id="Straight Connector 2" o:spid="_x0000_s1026" style="position:absolute;z-index:251695104;visibility:visible;mso-wrap-style:square;mso-width-percent:0;mso-height-percent:0;mso-wrap-distance-left:9pt;mso-wrap-distance-top:0;mso-wrap-distance-right:9pt;mso-wrap-distance-bottom:0;mso-position-horizontal:absolute;mso-position-horizontal-relative:text;mso-position-vertical:absolute;mso-position-vertical-relative:page;mso-width-percent:0;mso-height-percent:0;mso-width-relative:margin;mso-height-relative:margin" from="0,285pt" to="466.5pt,285pt" o:gfxdata="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" strokecolor="black [3200]" strokeweight="1pt">
+              <v:line w14:anchorId="5F22B07E" id="Straight Connector 2" o:spid="_x0000_s1026" style="position:absolute;z-index:251695104;visibility:visible;mso-wrap-style:square;mso-width-percent:0;mso-height-percent:0;mso-wrap-distance-left:9pt;mso-wrap-distance-top:0;mso-wrap-distance-right:9pt;mso-wrap-distance-bottom:0;mso-position-horizontal:absolute;mso-position-horizontal-relative:text;mso-position-vertical:absolute;mso-position-vertical-relative:page;mso-width-percent:0;mso-height-percent:0;mso-width-relative:margin;mso-height-relative:margin" from="0,285.3pt" to="448.2pt,285.3pt" o:gfxdata="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" strokecolor="black [3200]" strokeweight="1pt">
                 <v:stroke joinstyle="miter"/>
                 <w10:wrap anchory="page"/>
               </v:line>
@@ -1215,16 +1215,16 @@
         <mc:AlternateContent>
           <mc:Choice Requires="wps">
             <w:drawing>
-              <wp:anchor distT="0" distB="0" distL="114300" distR="114300" simplePos="0" relativeHeight="251663360" behindDoc="0" locked="0" layoutInCell="1" allowOverlap="1" wp14:anchorId="3D23DC87" wp14:editId="485C3B08">
+              <wp:anchor distT="0" distB="0" distL="114300" distR="114300" simplePos="0" relativeHeight="251663360" behindDoc="0" locked="0" layoutInCell="1" allowOverlap="1" wp14:anchorId="3D23DC87" wp14:editId="6277B8D7">
                 <wp:simplePos x="0" y="0"/>
                 <wp:positionH relativeFrom="column">
-                  <wp:posOffset>3657163</wp:posOffset>
+                  <wp:posOffset>3657600</wp:posOffset>
                 </wp:positionH>
                 <wp:positionV relativeFrom="paragraph">
-                  <wp:posOffset>173231</wp:posOffset>
+                  <wp:posOffset>156522</wp:posOffset>
                 </wp:positionV>
-                <wp:extent cx="1839372" cy="0"/>
-                <wp:effectExtent l="0" t="0" r="0" b="0"/>
+                <wp:extent cx="2027208" cy="17252"/>
+                <wp:effectExtent l="0" t="0" r="30480" b="20955"/>
                 <wp:wrapNone/>
                 <wp:docPr id="1772648697" name="Straight Connector 2"/>
                 <wp:cNvGraphicFramePr/>
@@ -1233,9 +1233,340 @@
                     <wps:wsp>
                       <wps:cNvCnPr/>
                       <wps:spPr>
+                        <a:xfrm flipV="1">
+                          <a:off x="0" y="0"/>
+                          <a:ext cx="2027208" cy="17252"/>
+                        </a:xfrm>
+                        <a:prstGeom prst="line">
+                          <a:avLst/>
+                        </a:prstGeom>
+                        <a:ln/>
+                      </wps:spPr>
+                      <wps:style>
+                        <a:lnRef idx="1">
+                          <a:schemeClr val="dk1"/>
+                        </a:lnRef>
+                        <a:fillRef idx="0">
+                          <a:schemeClr val="dk1"/>
+                        </a:fillRef>
+                        <a:effectRef idx="0">
+                          <a:schemeClr val="dk1"/>
+                        </a:effectRef>
+                        <a:fontRef idx="minor">
+                          <a:schemeClr val="tx1"/>
+                        </a:fontRef>
+                      </wps:style>
+                      <wps:bodyPr/>
+                    </wps:wsp>
+                  </a:graphicData>
+                </a:graphic>
+                <wp14:sizeRelH relativeFrom="margin">
+                  <wp14:pctWidth>0</wp14:pctWidth>
+                </wp14:sizeRelH>
+                <wp14:sizeRelV relativeFrom="margin">
+                  <wp14:pctHeight>0</wp14:pctHeight>
+                </wp14:sizeRelV>
+              </wp:anchor>
+            </w:drawing>
+          </mc:Choice>
+          <mc:Fallback>
+            <w:pict>
+              <v:line w14:anchorId="029EF1E9" id="Straight Connector 2" o:spid="_x0000_s1026" style="position:absolute;flip:y;z-index:251663360;visibility:visible;mso-wrap-style:square;mso-width-percent:0;mso-height-percent:0;mso-wrap-distance-left:9pt;mso-wrap-distance-top:0;mso-wrap-distance-right:9pt;mso-wrap-distance-bottom:0;mso-position-horizontal:absolute;mso-position-horizontal-relative:text;mso-position-vertical:absolute;mso-position-vertical-relative:text;mso-width-percent:0;mso-height-percent:0;mso-width-relative:margin;mso-height-relative:margin" from="4in,12.3pt" to="447.6pt,13.65pt" o:gfxdata="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" strokecolor="black [3200]" strokeweight="1pt">
+                <v:stroke joinstyle="miter"/>
+              </v:line>
+            </w:pict>
+          </mc:Fallback>
+        </mc:AlternateContent>
+      </w:r>
+      <w:proofErr w:type="gramStart"/>
+      <w:r>
+        <w:rPr>
+          <w:rFonts w:ascii="Arial" w:hAnsi="Arial" w:cs="Arial"/>
+        </w:rPr>
+        <w:t xml:space="preserve">{{ </w:t>
+      </w:r>
+      <w:proofErr w:type="spellStart"/>
+      <w:r>
+        <w:rPr>
+          <w:rFonts w:ascii="Arial" w:hAnsi="Arial" w:cs="Arial"/>
+        </w:rPr>
+        <w:t>wo</w:t>
+      </w:r>
+      <w:proofErr w:type="gramEnd"/>
+      <w:r>
+        <w:rPr>
+          <w:rFonts w:ascii="Arial" w:hAnsi="Arial" w:cs="Arial"/>
+        </w:rPr>
+        <w:t>_</w:t>
+      </w:r>
+      <w:r>
+        <w:rPr>
+          <w:rFonts w:ascii="Arial" w:hAnsi="Arial" w:cs="Arial"/>
+        </w:rPr>
+        <w:t>requested_</w:t>
+      </w:r>
+      <w:proofErr w:type="gramStart"/>
+      <w:r>
+        <w:rPr>
+          <w:rFonts w:ascii="Arial" w:hAnsi="Arial" w:cs="Arial"/>
+        </w:rPr>
+        <w:t>by</w:t>
+      </w:r>
+      <w:proofErr w:type="spellEnd"/>
+      <w:r>
+        <w:rPr>
+          <w:rFonts w:ascii="Arial" w:hAnsi="Arial" w:cs="Arial"/>
+        </w:rPr>
+        <w:t xml:space="preserve"> }</w:t>
+      </w:r>
+      <w:proofErr w:type="gramEnd"/>
+      <w:r>
+        <w:rPr>
+          <w:rFonts w:ascii="Arial" w:hAnsi="Arial" w:cs="Arial"/>
+        </w:rPr>
+        <w:t>}</w:t>
+      </w:r>
+    </w:p>
+    <w:p>
+      <w:pPr>
+        <w:spacing w:after="0" w:line="276" w:lineRule="auto"/>
+        <w:ind w:left="5040" w:firstLine="720"/>
+        <w:rPr>
+          <w:rFonts w:ascii="Arial" w:hAnsi="Arial" w:cs="Arial"/>
+        </w:rPr>
+      </w:pPr>
+      <w:r>
+        <w:rPr>
+          <w:rFonts w:ascii="Arial" w:hAnsi="Arial" w:cs="Arial"/>
+        </w:rPr>
+        <w:t>End-user/office</w:t>
+      </w:r>
+    </w:p>
+    <w:p>
+      <w:pPr>
+        <w:spacing w:after="0" w:line="276" w:lineRule="auto"/>
+        <w:rPr>
+          <w:rFonts w:ascii="Arial" w:hAnsi="Arial" w:cs="Arial"/>
+          <w:i/>
+          <w:iCs/>
+        </w:rPr>
+      </w:pPr>
+      <w:r>
+        <w:rPr>
+          <w:rFonts w:ascii="Arial" w:hAnsi="Arial" w:cs="Arial"/>
+          <w:u w:val="dotted"/>
+        </w:rPr>
+        <w:tab/>
+      </w:r>
+      <w:r>
+        <w:rPr>
+          <w:rFonts w:ascii="Arial" w:hAnsi="Arial" w:cs="Arial"/>
+          <w:u w:val="dotted"/>
+        </w:rPr>
+        <w:tab/>
+      </w:r>
+      <w:r>
+        <w:rPr>
+          <w:rFonts w:ascii="Arial" w:hAnsi="Arial" w:cs="Arial"/>
+          <w:u w:val="dotted"/>
+        </w:rPr>
+        <w:tab/>
+      </w:r>
+      <w:r>
+        <w:rPr>
+          <w:rFonts w:ascii="Arial" w:hAnsi="Arial" w:cs="Arial"/>
+          <w:u w:val="dotted"/>
+        </w:rPr>
+        <w:tab/>
+      </w:r>
+      <w:r>
+        <w:rPr>
+          <w:rFonts w:ascii="Arial" w:hAnsi="Arial" w:cs="Arial"/>
+          <w:u w:val="dotted"/>
+        </w:rPr>
+        <w:tab/>
+      </w:r>
+      <w:r>
+        <w:rPr>
+          <w:rFonts w:ascii="Arial" w:hAnsi="Arial" w:cs="Arial"/>
+          <w:u w:val="dotted"/>
+        </w:rPr>
+        <w:tab/>
+      </w:r>
+      <w:r>
+        <w:rPr>
+          <w:rFonts w:ascii="Arial" w:hAnsi="Arial" w:cs="Arial"/>
+          <w:u w:val="dotted"/>
+        </w:rPr>
+        <w:tab/>
+      </w:r>
+      <w:r>
+        <w:rPr>
+          <w:rFonts w:ascii="Arial" w:hAnsi="Arial" w:cs="Arial"/>
+          <w:u w:val="dotted"/>
+        </w:rPr>
+        <w:tab/>
+      </w:r>
+      <w:r>
+        <w:rPr>
+          <w:rFonts w:ascii="Arial" w:hAnsi="Arial" w:cs="Arial"/>
+          <w:u w:val="dotted"/>
+        </w:rPr>
+        <w:tab/>
+      </w:r>
+      <w:r>
+        <w:rPr>
+          <w:rFonts w:ascii="Arial" w:hAnsi="Arial" w:cs="Arial"/>
+          <w:u w:val="dotted"/>
+        </w:rPr>
+        <w:tab/>
+      </w:r>
+      <w:r>
+        <w:rPr>
+          <w:rFonts w:ascii="Arial" w:hAnsi="Arial" w:cs="Arial"/>
+          <w:u w:val="dotted"/>
+        </w:rPr>
+        <w:tab/>
+      </w:r>
+      <w:r>
+        <w:rPr>
+          <w:rFonts w:ascii="Arial" w:hAnsi="Arial" w:cs="Arial"/>
+          <w:u w:val="dotted"/>
+        </w:rPr>
+        <w:t xml:space="preserve">               .</w:t>
+      </w:r>
+    </w:p>
+    <w:p>
+      <w:pPr>
+        <w:spacing w:after="0" w:line="276" w:lineRule="auto"/>
+        <w:jc w:val="center"/>
+        <w:rPr>
+          <w:rFonts w:ascii="Arial" w:hAnsi="Arial" w:cs="Arial"/>
+          <w:i/>
+          <w:iCs/>
+          <w:sz w:val="22"/>
+          <w:szCs w:val="22"/>
+        </w:rPr>
+      </w:pPr>
+      <w:r>
+        <w:rPr>
+          <w:rFonts w:ascii="Arial" w:hAnsi="Arial" w:cs="Arial"/>
+          <w:i/>
+          <w:iCs/>
+          <w:sz w:val="22"/>
+          <w:szCs w:val="22"/>
+        </w:rPr>
+        <w:t>(To be filled out by the TSG Staff)</w:t>
+      </w:r>
+    </w:p>
+    <w:p>
+      <w:pPr>
+        <w:spacing w:after="0" w:line="276" w:lineRule="auto"/>
+        <w:rPr>
+          <w:rFonts w:ascii="Arial" w:hAnsi="Arial" w:cs="Arial"/>
+        </w:rPr>
+      </w:pPr>
+      <w:r>
+        <w:rPr>
+          <w:rFonts w:ascii="Arial" w:hAnsi="Arial" w:cs="Arial"/>
+          <w:b/>
+          <w:bCs/>
+        </w:rPr>
+        <w:t>Action Taken:</w:t>
+      </w:r>
+      <w:r>
+        <w:rPr>
+          <w:rFonts w:ascii="Arial" w:hAnsi="Arial" w:cs="Arial"/>
+        </w:rPr>
+        <w:tab/>
+      </w:r>
+      <w:r>
+        <w:rPr>
+          <w:rFonts w:ascii="Arial" w:hAnsi="Arial" w:cs="Arial"/>
+        </w:rPr>
+        <w:tab/>
+      </w:r>
+      <w:r>
+        <w:rPr>
+          <w:rFonts w:ascii="Arial" w:hAnsi="Arial" w:cs="Arial"/>
+        </w:rPr>
+        <w:tab/>
+      </w:r>
+      <w:r>
+        <w:rPr>
+          <w:rFonts w:ascii="Arial" w:hAnsi="Arial" w:cs="Arial"/>
+        </w:rPr>
+        <w:tab/>
+      </w:r>
+      <w:r>
+        <w:rPr>
+          <w:rFonts w:ascii="Arial" w:hAnsi="Arial" w:cs="Arial"/>
+        </w:rPr>
+        <w:tab/>
+      </w:r>
+      <w:r>
+        <w:rPr>
+          <w:rFonts w:ascii="Arial" w:hAnsi="Arial" w:cs="Arial"/>
+        </w:rPr>
+        <w:tab/>
+      </w:r>
+      <w:r>
+        <w:rPr>
+          <w:rFonts w:ascii="Arial" w:hAnsi="Arial" w:cs="Arial"/>
+        </w:rPr>
+        <w:tab/>
+      </w:r>
+      <w:r>
+        <w:rPr>
+          <w:rFonts w:ascii="Arial" w:hAnsi="Arial" w:cs="Arial"/>
+        </w:rPr>
+        <w:tab/>
+      </w:r>
+      <w:r>
+        <w:rPr>
+          <w:rFonts w:ascii="Arial" w:hAnsi="Arial" w:cs="Arial"/>
+        </w:rPr>
+        <w:tab/>
+      </w:r>
+    </w:p>
+    <w:p>
+      <w:pPr>
+        <w:spacing w:after="0" w:line="276" w:lineRule="auto"/>
+        <w:rPr>
+          <w:rFonts w:ascii="Arial" w:hAnsi="Arial" w:cs="Arial"/>
+        </w:rPr>
+      </w:pPr>
+      <w:r>
+        <w:rPr>
+          <w:rFonts w:ascii="Arial" w:hAnsi="Arial" w:cs="Arial"/>
+          <w:b/>
+          <w:bCs/>
+          <w:noProof/>
+        </w:rPr>
+        <mc:AlternateContent>
+          <mc:Choice Requires="wps">
+            <w:drawing>
+              <wp:anchor distT="0" distB="0" distL="114300" distR="114300" simplePos="0" relativeHeight="251671552" behindDoc="0" locked="0" layoutInCell="1" allowOverlap="1" wp14:anchorId="4E3B05B7" wp14:editId="5884E73D">
+                <wp:simplePos x="0" y="0"/>
+                <wp:positionH relativeFrom="column">
+                  <wp:posOffset>1</wp:posOffset>
+                </wp:positionH>
+                <wp:positionV relativeFrom="paragraph">
+                  <wp:posOffset>166741</wp:posOffset>
+                </wp:positionV>
+                <wp:extent cx="5691972" cy="0"/>
+                <wp:effectExtent l="0" t="0" r="0" b="0"/>
+                <wp:wrapNone/>
+                <wp:docPr id="572556466" name="Straight Connector 2"/>
+                <wp:cNvGraphicFramePr/>
+                <a:graphic xmlns:a="http://schemas.openxmlformats.org/drawingml/2006/main">
+                  <a:graphicData uri="http://schemas.microsoft.com/office/word/2010/wordprocessingShape">
+                    <wps:wsp>
+                      <wps:cNvCnPr/>
+                      <wps:spPr>
                         <a:xfrm>
                           <a:off x="0" y="0"/>
-                          <a:ext cx="1839372" cy="0"/>
+                          <a:ext cx="5691972" cy="0"/>
                         </a:xfrm>
                         <a:prstGeom prst="line">
                           <a:avLst/>
@@ -1268,7 +1599,7 @@
           </mc:Choice>
           <mc:Fallback>
             <w:pict>
-              <v:line w14:anchorId="41DBC79F" id="Straight Connector 2" o:spid="_x0000_s1026" style="position:absolute;z-index:251663360;visibility:visible;mso-wrap-style:square;mso-width-percent:0;mso-wrap-distance-left:9pt;mso-wrap-distance-top:0;mso-wrap-distance-right:9pt;mso-wrap-distance-bottom:0;mso-position-horizontal:absolute;mso-position-horizontal-relative:text;mso-position-vertical:absolute;mso-position-vertical-relative:text;mso-width-percent:0;mso-width-relative:margin" from="287.95pt,13.65pt" to="432.8pt,13.65pt" o:gfxdata="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" strokecolor="black [3200]" strokeweight="1pt">
+              <v:line w14:anchorId="5837A4DA" id="Straight Connector 2" o:spid="_x0000_s1026" style="position:absolute;z-index:251671552;visibility:visible;mso-wrap-style:square;mso-width-percent:0;mso-wrap-distance-left:9pt;mso-wrap-distance-top:0;mso-wrap-distance-right:9pt;mso-wrap-distance-bottom:0;mso-position-horizontal:absolute;mso-position-horizontal-relative:text;mso-position-vertical:absolute;mso-position-vertical-relative:text;mso-width-percent:0;mso-width-relative:margin" from="0,13.15pt" to="448.2pt,13.15pt" o:gfxdata="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" strokecolor="black [3200]" strokeweight="1pt">
                 <v:stroke joinstyle="miter"/>
               </v:line>
             </w:pict>
@@ -1296,18 +1627,12 @@
         </w:rPr>
         <w:t>_</w:t>
       </w:r>
-      <w:r>
-        <w:rPr>
-          <w:rFonts w:ascii="Arial" w:hAnsi="Arial" w:cs="Arial"/>
-        </w:rPr>
-        <w:t>requested_</w:t>
-      </w:r>
       <w:proofErr w:type="gramStart"/>
       <w:r>
         <w:rPr>
           <w:rFonts w:ascii="Arial" w:hAnsi="Arial" w:cs="Arial"/>
         </w:rPr>
-        <w:t>by</w:t>
+        <w:t>status</w:t>
       </w:r>
       <w:proofErr w:type="spellEnd"/>
       <w:r>
@@ -1322,490 +1647,161 @@
           <w:rFonts w:ascii="Arial" w:hAnsi="Arial" w:cs="Arial"/>
         </w:rPr>
         <w:t>}</w:t>
+      </w:r>
+      <w:r>
+        <w:rPr>
+          <w:rFonts w:ascii="Arial" w:hAnsi="Arial" w:cs="Arial"/>
+        </w:rPr>
+        <w:tab/>
+      </w:r>
+      <w:r>
+        <w:rPr>
+          <w:rFonts w:ascii="Arial" w:hAnsi="Arial" w:cs="Arial"/>
+        </w:rPr>
+        <w:tab/>
+      </w:r>
+      <w:r>
+        <w:rPr>
+          <w:rFonts w:ascii="Arial" w:hAnsi="Arial" w:cs="Arial"/>
+        </w:rPr>
+        <w:tab/>
+      </w:r>
+      <w:r>
+        <w:rPr>
+          <w:rFonts w:ascii="Arial" w:hAnsi="Arial" w:cs="Arial"/>
+        </w:rPr>
+        <w:tab/>
+      </w:r>
+      <w:r>
+        <w:rPr>
+          <w:rFonts w:ascii="Arial" w:hAnsi="Arial" w:cs="Arial"/>
+        </w:rPr>
+        <w:tab/>
+      </w:r>
+      <w:r>
+        <w:rPr>
+          <w:rFonts w:ascii="Arial" w:hAnsi="Arial" w:cs="Arial"/>
+        </w:rPr>
+        <w:tab/>
+      </w:r>
+      <w:r>
+        <w:rPr>
+          <w:rFonts w:ascii="Arial" w:hAnsi="Arial" w:cs="Arial"/>
+        </w:rPr>
+        <w:tab/>
+      </w:r>
+      <w:r>
+        <w:rPr>
+          <w:rFonts w:ascii="Arial" w:hAnsi="Arial" w:cs="Arial"/>
+        </w:rPr>
+        <w:tab/>
+      </w:r>
+      <w:r>
+        <w:rPr>
+          <w:rFonts w:ascii="Arial" w:hAnsi="Arial" w:cs="Arial"/>
+        </w:rPr>
+        <w:tab/>
+      </w:r>
+      <w:r>
+        <w:rPr>
+          <w:rFonts w:ascii="Arial" w:hAnsi="Arial" w:cs="Arial"/>
+        </w:rPr>
+        <w:tab/>
+      </w:r>
+      <w:r>
+        <w:rPr>
+          <w:rFonts w:ascii="Arial" w:hAnsi="Arial" w:cs="Arial"/>
+        </w:rPr>
+        <w:tab/>
+      </w:r>
+      <w:r>
+        <w:rPr>
+          <w:rFonts w:ascii="Arial" w:hAnsi="Arial" w:cs="Arial"/>
+        </w:rPr>
+        <w:tab/>
+      </w:r>
+      <w:r>
+        <w:rPr>
+          <w:rFonts w:ascii="Arial" w:hAnsi="Arial" w:cs="Arial"/>
+        </w:rPr>
+        <w:tab/>
+      </w:r>
+      <w:r>
+        <w:rPr>
+          <w:rFonts w:ascii="Arial" w:hAnsi="Arial" w:cs="Arial"/>
+        </w:rPr>
+        <w:tab/>
+      </w:r>
+      <w:r>
+        <w:rPr>
+          <w:rFonts w:ascii="Arial" w:hAnsi="Arial" w:cs="Arial"/>
+        </w:rPr>
+        <w:tab/>
+      </w:r>
+      <w:r>
+        <w:rPr>
+          <w:rFonts w:ascii="Arial" w:hAnsi="Arial" w:cs="Arial"/>
+        </w:rPr>
+        <w:tab/>
+      </w:r>
+      <w:r>
+        <w:rPr>
+          <w:rFonts w:ascii="Arial" w:hAnsi="Arial" w:cs="Arial"/>
+        </w:rPr>
+        <w:tab/>
+      </w:r>
+      <w:r>
+        <w:rPr>
+          <w:rFonts w:ascii="Arial" w:hAnsi="Arial" w:cs="Arial"/>
+        </w:rPr>
+        <w:tab/>
+      </w:r>
+      <w:r>
+        <w:rPr>
+          <w:rFonts w:ascii="Arial" w:hAnsi="Arial" w:cs="Arial"/>
+        </w:rPr>
+        <w:tab/>
+      </w:r>
+      <w:r>
+        <w:rPr>
+          <w:rFonts w:ascii="Arial" w:hAnsi="Arial" w:cs="Arial"/>
+        </w:rPr>
+        <w:tab/>
+      </w:r>
+      <w:r>
+        <w:rPr>
+          <w:rFonts w:ascii="Arial" w:hAnsi="Arial" w:cs="Arial"/>
+        </w:rPr>
+        <w:tab/>
       </w:r>
     </w:p>
     <w:p>
       <w:pPr>
         <w:spacing w:after="0" w:line="276" w:lineRule="auto"/>
-        <w:ind w:left="5040" w:firstLine="720"/>
-        <w:rPr>
-          <w:rFonts w:ascii="Arial" w:hAnsi="Arial" w:cs="Arial"/>
-        </w:rPr>
-      </w:pPr>
-      <w:r>
-        <w:rPr>
-          <w:rFonts w:ascii="Arial" w:hAnsi="Arial" w:cs="Arial"/>
-        </w:rPr>
-        <w:t>End-user/office</w:t>
-      </w:r>
-    </w:p>
-    <w:p>
-      <w:pPr>
-        <w:spacing w:after="0" w:line="276" w:lineRule="auto"/>
-        <w:rPr>
-          <w:rFonts w:ascii="Arial" w:hAnsi="Arial" w:cs="Arial"/>
-          <w:i/>
-          <w:iCs/>
-        </w:rPr>
-      </w:pPr>
-      <w:r>
-        <w:rPr>
-          <w:rFonts w:ascii="Arial" w:hAnsi="Arial" w:cs="Arial"/>
-          <w:u w:val="dotted"/>
-        </w:rPr>
-        <w:tab/>
-      </w:r>
-      <w:r>
-        <w:rPr>
-          <w:rFonts w:ascii="Arial" w:hAnsi="Arial" w:cs="Arial"/>
-          <w:u w:val="dotted"/>
-        </w:rPr>
-        <w:tab/>
-      </w:r>
-      <w:r>
-        <w:rPr>
-          <w:rFonts w:ascii="Arial" w:hAnsi="Arial" w:cs="Arial"/>
-          <w:u w:val="dotted"/>
-        </w:rPr>
-        <w:tab/>
-      </w:r>
-      <w:r>
-        <w:rPr>
-          <w:rFonts w:ascii="Arial" w:hAnsi="Arial" w:cs="Arial"/>
-          <w:u w:val="dotted"/>
-        </w:rPr>
-        <w:tab/>
-      </w:r>
-      <w:r>
-        <w:rPr>
-          <w:rFonts w:ascii="Arial" w:hAnsi="Arial" w:cs="Arial"/>
-          <w:u w:val="dotted"/>
-        </w:rPr>
-        <w:tab/>
-      </w:r>
-      <w:r>
-        <w:rPr>
-          <w:rFonts w:ascii="Arial" w:hAnsi="Arial" w:cs="Arial"/>
-          <w:u w:val="dotted"/>
-        </w:rPr>
-        <w:tab/>
-      </w:r>
-      <w:r>
-        <w:rPr>
-          <w:rFonts w:ascii="Arial" w:hAnsi="Arial" w:cs="Arial"/>
-          <w:u w:val="dotted"/>
-        </w:rPr>
-        <w:tab/>
-      </w:r>
-      <w:r>
-        <w:rPr>
-          <w:rFonts w:ascii="Arial" w:hAnsi="Arial" w:cs="Arial"/>
-          <w:u w:val="dotted"/>
-        </w:rPr>
-        <w:tab/>
-      </w:r>
-      <w:r>
-        <w:rPr>
-          <w:rFonts w:ascii="Arial" w:hAnsi="Arial" w:cs="Arial"/>
-          <w:u w:val="dotted"/>
-        </w:rPr>
-        <w:tab/>
-      </w:r>
-      <w:r>
-        <w:rPr>
-          <w:rFonts w:ascii="Arial" w:hAnsi="Arial" w:cs="Arial"/>
-          <w:u w:val="dotted"/>
-        </w:rPr>
-        <w:tab/>
-      </w:r>
-      <w:r>
-        <w:rPr>
-          <w:rFonts w:ascii="Arial" w:hAnsi="Arial" w:cs="Arial"/>
-          <w:u w:val="dotted"/>
-        </w:rPr>
-        <w:tab/>
-      </w:r>
-      <w:r>
-        <w:rPr>
-          <w:rFonts w:ascii="Arial" w:hAnsi="Arial" w:cs="Arial"/>
-          <w:u w:val="dotted"/>
-        </w:rPr>
-        <w:tab/>
-      </w:r>
-      <w:r>
-        <w:rPr>
-          <w:rFonts w:ascii="Arial" w:hAnsi="Arial" w:cs="Arial"/>
-          <w:u w:val="dotted"/>
-        </w:rPr>
-        <w:tab/>
-      </w:r>
-    </w:p>
-    <w:p>
-      <w:pPr>
-        <w:spacing w:after="0" w:line="276" w:lineRule="auto"/>
-        <w:jc w:val="center"/>
-        <w:rPr>
-          <w:rFonts w:ascii="Arial" w:hAnsi="Arial" w:cs="Arial"/>
-          <w:i/>
-          <w:iCs/>
-          <w:sz w:val="22"/>
-          <w:szCs w:val="22"/>
-        </w:rPr>
-      </w:pPr>
-      <w:r>
-        <w:rPr>
-          <w:rFonts w:ascii="Arial" w:hAnsi="Arial" w:cs="Arial"/>
-          <w:i/>
-          <w:iCs/>
-          <w:sz w:val="22"/>
-          <w:szCs w:val="22"/>
-        </w:rPr>
-        <w:t>(To be filled out by the TSG Staff)</w:t>
-      </w:r>
-    </w:p>
-    <w:p>
-      <w:pPr>
-        <w:spacing w:after="0" w:line="276" w:lineRule="auto"/>
-        <w:rPr>
-          <w:rFonts w:ascii="Arial" w:hAnsi="Arial" w:cs="Arial"/>
-        </w:rPr>
-      </w:pPr>
-      <w:r>
         <w:rPr>
           <w:rFonts w:ascii="Arial" w:hAnsi="Arial" w:cs="Arial"/>
           <w:b/>
           <w:bCs/>
         </w:rPr>
-        <w:t>Action Taken:</w:t>
-      </w:r>
-      <w:r>
-        <w:rPr>
-          <w:rFonts w:ascii="Arial" w:hAnsi="Arial" w:cs="Arial"/>
-        </w:rPr>
-        <w:tab/>
-      </w:r>
-      <w:r>
-        <w:rPr>
-          <w:rFonts w:ascii="Arial" w:hAnsi="Arial" w:cs="Arial"/>
-        </w:rPr>
-        <w:tab/>
-      </w:r>
-      <w:r>
-        <w:rPr>
-          <w:rFonts w:ascii="Arial" w:hAnsi="Arial" w:cs="Arial"/>
-        </w:rPr>
-        <w:tab/>
-      </w:r>
-      <w:r>
-        <w:rPr>
-          <w:rFonts w:ascii="Arial" w:hAnsi="Arial" w:cs="Arial"/>
-        </w:rPr>
-        <w:tab/>
-      </w:r>
-      <w:r>
-        <w:rPr>
-          <w:rFonts w:ascii="Arial" w:hAnsi="Arial" w:cs="Arial"/>
-        </w:rPr>
-        <w:tab/>
-      </w:r>
-      <w:r>
-        <w:rPr>
-          <w:rFonts w:ascii="Arial" w:hAnsi="Arial" w:cs="Arial"/>
-        </w:rPr>
-        <w:tab/>
-      </w:r>
-      <w:r>
-        <w:rPr>
-          <w:rFonts w:ascii="Arial" w:hAnsi="Arial" w:cs="Arial"/>
-        </w:rPr>
-        <w:tab/>
-      </w:r>
-      <w:r>
-        <w:rPr>
-          <w:rFonts w:ascii="Arial" w:hAnsi="Arial" w:cs="Arial"/>
-        </w:rPr>
-        <w:tab/>
-      </w:r>
-      <w:r>
-        <w:rPr>
-          <w:rFonts w:ascii="Arial" w:hAnsi="Arial" w:cs="Arial"/>
-        </w:rPr>
-        <w:tab/>
-      </w:r>
-    </w:p>
-    <w:p>
-      <w:pPr>
-        <w:spacing w:after="0" w:line="276" w:lineRule="auto"/>
-        <w:rPr>
-          <w:rFonts w:ascii="Arial" w:hAnsi="Arial" w:cs="Arial"/>
-        </w:rPr>
       </w:pPr>
       <w:r>
         <w:rPr>
           <w:rFonts w:ascii="Arial" w:hAnsi="Arial" w:cs="Arial"/>
-          <w:b/>
-          <w:bCs/>
           <w:noProof/>
         </w:rPr>
         <mc:AlternateContent>
           <mc:Choice Requires="wps">
             <w:drawing>
-              <wp:anchor distT="0" distB="0" distL="114300" distR="114300" simplePos="0" relativeHeight="251671552" behindDoc="0" locked="0" layoutInCell="1" allowOverlap="1" wp14:anchorId="4E3B05B7" wp14:editId="1B106FE5">
+              <wp:anchor distT="45720" distB="45720" distL="114300" distR="114300" simplePos="0" relativeHeight="251707392" behindDoc="1" locked="0" layoutInCell="1" allowOverlap="1" wp14:anchorId="3B8C085B" wp14:editId="2A15D9C9">
                 <wp:simplePos x="0" y="0"/>
                 <wp:positionH relativeFrom="column">
-                  <wp:posOffset>0</wp:posOffset>
+                  <wp:posOffset>-78828</wp:posOffset>
                 </wp:positionH>
                 <wp:positionV relativeFrom="paragraph">
-                  <wp:posOffset>164245</wp:posOffset>
+                  <wp:posOffset>149028</wp:posOffset>
                 </wp:positionV>
-                <wp:extent cx="5934269" cy="0"/>
-                <wp:effectExtent l="0" t="0" r="0" b="0"/>
-                <wp:wrapNone/>
-                <wp:docPr id="572556466" name="Straight Connector 2"/>
-                <wp:cNvGraphicFramePr/>
-                <a:graphic xmlns:a="http://schemas.openxmlformats.org/drawingml/2006/main">
-                  <a:graphicData uri="http://schemas.microsoft.com/office/word/2010/wordprocessingShape">
-                    <wps:wsp>
-                      <wps:cNvCnPr/>
-                      <wps:spPr>
-                        <a:xfrm>
-                          <a:off x="0" y="0"/>
-                          <a:ext cx="5934269" cy="0"/>
-                        </a:xfrm>
-                        <a:prstGeom prst="line">
-                          <a:avLst/>
-                        </a:prstGeom>
-                        <a:ln/>
-                      </wps:spPr>
-                      <wps:style>
-                        <a:lnRef idx="1">
-                          <a:schemeClr val="dk1"/>
-                        </a:lnRef>
-                        <a:fillRef idx="0">
-                          <a:schemeClr val="dk1"/>
-                        </a:fillRef>
-                        <a:effectRef idx="0">
-                          <a:schemeClr val="dk1"/>
-                        </a:effectRef>
-                        <a:fontRef idx="minor">
-                          <a:schemeClr val="tx1"/>
-                        </a:fontRef>
-                      </wps:style>
-                      <wps:bodyPr/>
-                    </wps:wsp>
-                  </a:graphicData>
-                </a:graphic>
-                <wp14:sizeRelH relativeFrom="margin">
-                  <wp14:pctWidth>0</wp14:pctWidth>
-                </wp14:sizeRelH>
-              </wp:anchor>
-            </w:drawing>
-          </mc:Choice>
-          <mc:Fallback>
-            <w:pict>
-              <v:line w14:anchorId="087089A1" id="Straight Connector 2" o:spid="_x0000_s1026" style="position:absolute;z-index:251671552;visibility:visible;mso-wrap-style:square;mso-width-percent:0;mso-wrap-distance-left:9pt;mso-wrap-distance-top:0;mso-wrap-distance-right:9pt;mso-wrap-distance-bottom:0;mso-position-horizontal:absolute;mso-position-horizontal-relative:text;mso-position-vertical:absolute;mso-position-vertical-relative:text;mso-width-percent:0;mso-width-relative:margin" from="0,12.95pt" to="467.25pt,12.95pt" o:gfxdata="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" strokecolor="black [3200]" strokeweight="1pt">
-                <v:stroke joinstyle="miter"/>
-              </v:line>
-            </w:pict>
-          </mc:Fallback>
-        </mc:AlternateContent>
-      </w:r>
-      <w:proofErr w:type="gramStart"/>
-      <w:r>
-        <w:rPr>
-          <w:rFonts w:ascii="Arial" w:hAnsi="Arial" w:cs="Arial"/>
-        </w:rPr>
-        <w:t xml:space="preserve">{{ </w:t>
-      </w:r>
-      <w:proofErr w:type="spellStart"/>
-      <w:r>
-        <w:rPr>
-          <w:rFonts w:ascii="Arial" w:hAnsi="Arial" w:cs="Arial"/>
-        </w:rPr>
-        <w:t>wo</w:t>
-      </w:r>
-      <w:proofErr w:type="gramEnd"/>
-      <w:r>
-        <w:rPr>
-          <w:rFonts w:ascii="Arial" w:hAnsi="Arial" w:cs="Arial"/>
-        </w:rPr>
-        <w:t>_</w:t>
-      </w:r>
-      <w:proofErr w:type="gramStart"/>
-      <w:r>
-        <w:rPr>
-          <w:rFonts w:ascii="Arial" w:hAnsi="Arial" w:cs="Arial"/>
-        </w:rPr>
-        <w:t>status</w:t>
-      </w:r>
-      <w:proofErr w:type="spellEnd"/>
-      <w:r>
-        <w:rPr>
-          <w:rFonts w:ascii="Arial" w:hAnsi="Arial" w:cs="Arial"/>
-        </w:rPr>
-        <w:t xml:space="preserve"> }</w:t>
-      </w:r>
-      <w:proofErr w:type="gramEnd"/>
-      <w:r>
-        <w:rPr>
-          <w:rFonts w:ascii="Arial" w:hAnsi="Arial" w:cs="Arial"/>
-        </w:rPr>
-        <w:t>}</w:t>
-      </w:r>
-      <w:r>
-        <w:rPr>
-          <w:rFonts w:ascii="Arial" w:hAnsi="Arial" w:cs="Arial"/>
-        </w:rPr>
-        <w:tab/>
-      </w:r>
-      <w:r>
-        <w:rPr>
-          <w:rFonts w:ascii="Arial" w:hAnsi="Arial" w:cs="Arial"/>
-        </w:rPr>
-        <w:tab/>
-      </w:r>
-      <w:r>
-        <w:rPr>
-          <w:rFonts w:ascii="Arial" w:hAnsi="Arial" w:cs="Arial"/>
-        </w:rPr>
-        <w:tab/>
-      </w:r>
-      <w:r>
-        <w:rPr>
-          <w:rFonts w:ascii="Arial" w:hAnsi="Arial" w:cs="Arial"/>
-        </w:rPr>
-        <w:tab/>
-      </w:r>
-      <w:r>
-        <w:rPr>
-          <w:rFonts w:ascii="Arial" w:hAnsi="Arial" w:cs="Arial"/>
-        </w:rPr>
-        <w:tab/>
-      </w:r>
-      <w:r>
-        <w:rPr>
-          <w:rFonts w:ascii="Arial" w:hAnsi="Arial" w:cs="Arial"/>
-        </w:rPr>
-        <w:tab/>
-      </w:r>
-      <w:r>
-        <w:rPr>
-          <w:rFonts w:ascii="Arial" w:hAnsi="Arial" w:cs="Arial"/>
-        </w:rPr>
-        <w:tab/>
-      </w:r>
-      <w:r>
-        <w:rPr>
-          <w:rFonts w:ascii="Arial" w:hAnsi="Arial" w:cs="Arial"/>
-        </w:rPr>
-        <w:tab/>
-      </w:r>
-      <w:r>
-        <w:rPr>
-          <w:rFonts w:ascii="Arial" w:hAnsi="Arial" w:cs="Arial"/>
-        </w:rPr>
-        <w:tab/>
-      </w:r>
-      <w:r>
-        <w:rPr>
-          <w:rFonts w:ascii="Arial" w:hAnsi="Arial" w:cs="Arial"/>
-        </w:rPr>
-        <w:tab/>
-      </w:r>
-      <w:r>
-        <w:rPr>
-          <w:rFonts w:ascii="Arial" w:hAnsi="Arial" w:cs="Arial"/>
-        </w:rPr>
-        <w:tab/>
-      </w:r>
-      <w:r>
-        <w:rPr>
-          <w:rFonts w:ascii="Arial" w:hAnsi="Arial" w:cs="Arial"/>
-        </w:rPr>
-        <w:tab/>
-      </w:r>
-      <w:r>
-        <w:rPr>
-          <w:rFonts w:ascii="Arial" w:hAnsi="Arial" w:cs="Arial"/>
-        </w:rPr>
-        <w:tab/>
-      </w:r>
-      <w:r>
-        <w:rPr>
-          <w:rFonts w:ascii="Arial" w:hAnsi="Arial" w:cs="Arial"/>
-        </w:rPr>
-        <w:tab/>
-      </w:r>
-      <w:r>
-        <w:rPr>
-          <w:rFonts w:ascii="Arial" w:hAnsi="Arial" w:cs="Arial"/>
-        </w:rPr>
-        <w:tab/>
-      </w:r>
-      <w:r>
-        <w:rPr>
-          <w:rFonts w:ascii="Arial" w:hAnsi="Arial" w:cs="Arial"/>
-        </w:rPr>
-        <w:tab/>
-      </w:r>
-      <w:r>
-        <w:rPr>
-          <w:rFonts w:ascii="Arial" w:hAnsi="Arial" w:cs="Arial"/>
-        </w:rPr>
-        <w:tab/>
-      </w:r>
-      <w:r>
-        <w:rPr>
-          <w:rFonts w:ascii="Arial" w:hAnsi="Arial" w:cs="Arial"/>
-        </w:rPr>
-        <w:tab/>
-      </w:r>
-      <w:r>
-        <w:rPr>
-          <w:rFonts w:ascii="Arial" w:hAnsi="Arial" w:cs="Arial"/>
-        </w:rPr>
-        <w:tab/>
-      </w:r>
-      <w:r>
-        <w:rPr>
-          <w:rFonts w:ascii="Arial" w:hAnsi="Arial" w:cs="Arial"/>
-        </w:rPr>
-        <w:tab/>
-      </w:r>
-      <w:r>
-        <w:rPr>
-          <w:rFonts w:ascii="Arial" w:hAnsi="Arial" w:cs="Arial"/>
-        </w:rPr>
-        <w:tab/>
-      </w:r>
-    </w:p>
-    <w:p>
-      <w:pPr>
-        <w:spacing w:after="0" w:line="276" w:lineRule="auto"/>
-        <w:rPr>
-          <w:rFonts w:ascii="Arial" w:hAnsi="Arial" w:cs="Arial"/>
-          <w:b/>
-          <w:bCs/>
-        </w:rPr>
-      </w:pPr>
-      <w:r>
-        <w:rPr>
-          <w:rFonts w:ascii="Arial" w:hAnsi="Arial" w:cs="Arial"/>
-          <w:noProof/>
-        </w:rPr>
-        <mc:AlternateContent>
-          <mc:Choice Requires="wps">
-            <w:drawing>
-              <wp:anchor distT="45720" distB="45720" distL="114300" distR="114300" simplePos="0" relativeHeight="251707392" behindDoc="1" locked="0" layoutInCell="1" allowOverlap="1" wp14:anchorId="3B8C085B" wp14:editId="576FCBAD">
-                <wp:simplePos x="0" y="0"/>
-                <wp:positionH relativeFrom="column">
-                  <wp:posOffset>-76200</wp:posOffset>
-                </wp:positionH>
-                <wp:positionV relativeFrom="paragraph">
-                  <wp:posOffset>144780</wp:posOffset>
-                </wp:positionV>
-                <wp:extent cx="6124575" cy="762000"/>
-                <wp:effectExtent l="0" t="0" r="9525" b="0"/>
+                <wp:extent cx="5770180" cy="762000"/>
+                <wp:effectExtent l="0" t="0" r="2540" b="0"/>
                 <wp:wrapNone/>
                 <wp:docPr id="485834645" name="Text Box 2"/>
                 <wp:cNvGraphicFramePr>
@@ -1820,7 +1816,7 @@
                       <wps:spPr bwMode="auto">
                         <a:xfrm>
                           <a:off x="0" y="0"/>
-                          <a:ext cx="6124575" cy="762000"/>
+                          <a:ext cx="5770180" cy="762000"/>
                         </a:xfrm>
                         <a:prstGeom prst="rect">
                           <a:avLst/>
@@ -1913,7 +1909,7 @@
           </mc:Choice>
           <mc:Fallback>
             <w:pict>
-              <v:shape w14:anchorId="3B8C085B" id="_x0000_s1027" type="#_x0000_t202" style="position:absolute;margin-left:-6pt;margin-top:11.4pt;width:482.25pt;height:60pt;z-index:-251609088;visibility:visible;mso-wrap-style:square;mso-width-percent:0;mso-height-percent:0;mso-wrap-distance-left:9pt;mso-wrap-distance-top:3.6pt;mso-wrap-distance-right:9pt;mso-wrap-distance-bottom:3.6pt;mso-position-horizontal:absolute;mso-position-horizontal-relative:text;mso-position-vertical:absolute;mso-position-vertical-relative:text;mso-width-percent:0;mso-height-percent:0;mso-width-relative:margin;mso-height-relative:margin;v-text-anchor:top" o:gfxdata="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" stroked="f">
+              <v:shape w14:anchorId="3B8C085B" id="_x0000_s1027" type="#_x0000_t202" style="position:absolute;margin-left:-6.2pt;margin-top:11.75pt;width:454.35pt;height:60pt;z-index:-251609088;visibility:visible;mso-wrap-style:square;mso-width-percent:0;mso-height-percent:0;mso-wrap-distance-left:9pt;mso-wrap-distance-top:3.6pt;mso-wrap-distance-right:9pt;mso-wrap-distance-bottom:3.6pt;mso-position-horizontal:absolute;mso-position-horizontal-relative:text;mso-position-vertical:absolute;mso-position-vertical-relative:text;mso-width-percent:0;mso-height-percent:0;mso-width-relative:margin;mso-height-relative:margin;v-text-anchor:top" o:gfxdata="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" stroked="f">
                 <v:textbox>
                   <w:txbxContent>
                     <w:p>
@@ -2017,18 +2013,18 @@
         <mc:AlternateContent>
           <mc:Choice Requires="wps">
             <w:drawing>
-              <wp:anchor distT="0" distB="0" distL="114300" distR="114300" simplePos="0" relativeHeight="251701248" behindDoc="0" locked="0" layoutInCell="1" allowOverlap="1" wp14:anchorId="1765BE5A" wp14:editId="397EE214">
+              <wp:anchor distT="0" distB="0" distL="114300" distR="114300" simplePos="0" relativeHeight="251697152" behindDoc="0" locked="0" layoutInCell="1" allowOverlap="1" wp14:anchorId="65ED8DD1" wp14:editId="4D0371E9">
                 <wp:simplePos x="0" y="0"/>
                 <wp:positionH relativeFrom="column">
-                  <wp:posOffset>-9525</wp:posOffset>
+                  <wp:posOffset>0</wp:posOffset>
                 </wp:positionH>
                 <wp:positionV relativeFrom="page">
-                  <wp:posOffset>5867400</wp:posOffset>
+                  <wp:posOffset>6090249</wp:posOffset>
                 </wp:positionV>
-                <wp:extent cx="5924550" cy="0"/>
+                <wp:extent cx="5691972" cy="0"/>
                 <wp:effectExtent l="0" t="0" r="0" b="0"/>
                 <wp:wrapNone/>
-                <wp:docPr id="1354724307" name="Straight Connector 2"/>
+                <wp:docPr id="2038905114" name="Straight Connector 2"/>
                 <wp:cNvGraphicFramePr/>
                 <a:graphic xmlns:a="http://schemas.openxmlformats.org/drawingml/2006/main">
                   <a:graphicData uri="http://schemas.microsoft.com/office/word/2010/wordprocessingShape">
@@ -2037,7 +2033,7 @@
                       <wps:spPr>
                         <a:xfrm>
                           <a:off x="0" y="0"/>
-                          <a:ext cx="5924550" cy="0"/>
+                          <a:ext cx="5691972" cy="0"/>
                         </a:xfrm>
                         <a:prstGeom prst="line">
                           <a:avLst/>
@@ -2073,7 +2069,7 @@
           </mc:Choice>
           <mc:Fallback>
             <w:pict>
-              <v:line w14:anchorId="58CDB9D3" id="Straight Connector 2" o:spid="_x0000_s1026" style="position:absolute;z-index:251701248;visibility:visible;mso-wrap-style:square;mso-width-percent:0;mso-height-percent:0;mso-wrap-distance-left:9pt;mso-wrap-distance-top:0;mso-wrap-distance-right:9pt;mso-wrap-distance-bottom:0;mso-position-horizontal:absolute;mso-position-horizontal-relative:text;mso-position-vertical:absolute;mso-position-vertical-relative:page;mso-width-percent:0;mso-height-percent:0;mso-width-relative:margin;mso-height-relative:margin" from="-.75pt,462pt" to="465.75pt,462pt" o:gfxdata="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" strokecolor="black [3200]" strokeweight="1pt">
+              <v:line w14:anchorId="79184620" id="Straight Connector 2" o:spid="_x0000_s1026" style="position:absolute;z-index:251697152;visibility:visible;mso-wrap-style:square;mso-width-percent:0;mso-height-percent:0;mso-wrap-distance-left:9pt;mso-wrap-distance-top:0;mso-wrap-distance-right:9pt;mso-wrap-distance-bottom:0;mso-position-horizontal:absolute;mso-position-horizontal-relative:text;mso-position-vertical:absolute;mso-position-vertical-relative:page;mso-width-percent:0;mso-height-percent:0;mso-width-relative:margin;mso-height-relative:margin" from="0,479.55pt" to="448.2pt,479.55pt" o:gfxdata="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" strokecolor="black [3200]" strokeweight="1pt">
                 <v:stroke joinstyle="miter"/>
                 <w10:wrap anchory="page"/>
               </v:line>
@@ -2102,18 +2098,18 @@
         <mc:AlternateContent>
           <mc:Choice Requires="wps">
             <w:drawing>
-              <wp:anchor distT="0" distB="0" distL="114300" distR="114300" simplePos="0" relativeHeight="251697152" behindDoc="0" locked="0" layoutInCell="1" allowOverlap="1" wp14:anchorId="65ED8DD1" wp14:editId="7D7356C3">
+              <wp:anchor distT="0" distB="0" distL="114300" distR="114300" simplePos="0" relativeHeight="251658239" behindDoc="0" locked="0" layoutInCell="1" allowOverlap="1" wp14:anchorId="52CB5A08" wp14:editId="28C031CF">
                 <wp:simplePos x="0" y="0"/>
                 <wp:positionH relativeFrom="column">
-                  <wp:posOffset>0</wp:posOffset>
+                  <wp:posOffset>-8626</wp:posOffset>
                 </wp:positionH>
                 <wp:positionV relativeFrom="page">
-                  <wp:posOffset>6086475</wp:posOffset>
+                  <wp:posOffset>6288657</wp:posOffset>
                 </wp:positionV>
-                <wp:extent cx="5924550" cy="0"/>
+                <wp:extent cx="5700131" cy="0"/>
                 <wp:effectExtent l="0" t="0" r="0" b="0"/>
                 <wp:wrapNone/>
-                <wp:docPr id="2038905114" name="Straight Connector 2"/>
+                <wp:docPr id="1043732818" name="Straight Connector 2"/>
                 <wp:cNvGraphicFramePr/>
                 <a:graphic xmlns:a="http://schemas.openxmlformats.org/drawingml/2006/main">
                   <a:graphicData uri="http://schemas.microsoft.com/office/word/2010/wordprocessingShape">
@@ -2122,7 +2118,7 @@
                       <wps:spPr>
                         <a:xfrm>
                           <a:off x="0" y="0"/>
-                          <a:ext cx="5924550" cy="0"/>
+                          <a:ext cx="5700131" cy="0"/>
                         </a:xfrm>
                         <a:prstGeom prst="line">
                           <a:avLst/>
@@ -2158,7 +2154,7 @@
           </mc:Choice>
           <mc:Fallback>
             <w:pict>
-              <v:line w14:anchorId="0626B2E9" id="Straight Connector 2" o:spid="_x0000_s1026" style="position:absolute;z-index:251697152;visibility:visible;mso-wrap-style:square;mso-width-percent:0;mso-height-percent:0;mso-wrap-distance-left:9pt;mso-wrap-distance-top:0;mso-wrap-distance-right:9pt;mso-wrap-distance-bottom:0;mso-position-horizontal:absolute;mso-position-horizontal-relative:text;mso-position-vertical:absolute;mso-position-vertical-relative:page;mso-width-percent:0;mso-height-percent:0;mso-width-relative:margin;mso-height-relative:margin" from="0,479.25pt" to="466.5pt,479.25pt" o:gfxdata="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" strokecolor="black [3200]" strokeweight="1pt">
+              <v:line w14:anchorId="7AF68168" id="Straight Connector 2" o:spid="_x0000_s1026" style="position:absolute;z-index:251658239;visibility:visible;mso-wrap-style:square;mso-width-percent:0;mso-height-percent:0;mso-wrap-distance-left:9pt;mso-wrap-distance-top:0;mso-wrap-distance-right:9pt;mso-wrap-distance-bottom:0;mso-position-horizontal:absolute;mso-position-horizontal-relative:text;mso-position-vertical:absolute;mso-position-vertical-relative:page;mso-width-percent:0;mso-height-percent:0;mso-width-relative:margin;mso-height-relative:margin" from="-.7pt,495.15pt" to="448.15pt,495.15pt" o:gfxdata="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" strokecolor="black [3200]" strokeweight="1pt">
                 <v:stroke joinstyle="miter"/>
                 <w10:wrap anchory="page"/>
               </v:line>
@@ -2186,18 +2182,18 @@
         <mc:AlternateContent>
           <mc:Choice Requires="wps">
             <w:drawing>
-              <wp:anchor distT="0" distB="0" distL="114300" distR="114300" simplePos="0" relativeHeight="251658239" behindDoc="0" locked="0" layoutInCell="1" allowOverlap="1" wp14:anchorId="52CB5A08" wp14:editId="2DA00172">
+              <wp:anchor distT="0" distB="0" distL="114300" distR="114300" simplePos="0" relativeHeight="251701248" behindDoc="0" locked="0" layoutInCell="1" allowOverlap="1" wp14:anchorId="1765BE5A" wp14:editId="396ED4EE">
                 <wp:simplePos x="0" y="0"/>
                 <wp:positionH relativeFrom="column">
-                  <wp:posOffset>-9525</wp:posOffset>
+                  <wp:posOffset>8626</wp:posOffset>
                 </wp:positionH>
                 <wp:positionV relativeFrom="page">
-                  <wp:posOffset>6286500</wp:posOffset>
+                  <wp:posOffset>6504317</wp:posOffset>
                 </wp:positionV>
-                <wp:extent cx="5924550" cy="0"/>
+                <wp:extent cx="5682508" cy="0"/>
                 <wp:effectExtent l="0" t="0" r="0" b="0"/>
                 <wp:wrapNone/>
-                <wp:docPr id="1043732818" name="Straight Connector 2"/>
+                <wp:docPr id="1354724307" name="Straight Connector 2"/>
                 <wp:cNvGraphicFramePr/>
                 <a:graphic xmlns:a="http://schemas.openxmlformats.org/drawingml/2006/main">
                   <a:graphicData uri="http://schemas.microsoft.com/office/word/2010/wordprocessingShape">
@@ -2206,7 +2202,7 @@
                       <wps:spPr>
                         <a:xfrm>
                           <a:off x="0" y="0"/>
-                          <a:ext cx="5924550" cy="0"/>
+                          <a:ext cx="5682508" cy="0"/>
                         </a:xfrm>
                         <a:prstGeom prst="line">
                           <a:avLst/>
@@ -2242,7 +2238,7 @@
           </mc:Choice>
           <mc:Fallback>
             <w:pict>
-              <v:line w14:anchorId="3FBD4B38" id="Straight Connector 2" o:spid="_x0000_s1026" style="position:absolute;z-index:251658239;visibility:visible;mso-wrap-style:square;mso-width-percent:0;mso-height-percent:0;mso-wrap-distance-left:9pt;mso-wrap-distance-top:0;mso-wrap-distance-right:9pt;mso-wrap-distance-bottom:0;mso-position-horizontal:absolute;mso-position-horizontal-relative:text;mso-position-vertical:absolute;mso-position-vertical-relative:page;mso-width-percent:0;mso-height-percent:0;mso-width-relative:margin;mso-height-relative:margin" from="-.75pt,495pt" to="465.75pt,495pt" o:gfxdata="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" strokecolor="black [3200]" strokeweight="1pt">
+              <v:line w14:anchorId="02D1A6F4" id="Straight Connector 2" o:spid="_x0000_s1026" style="position:absolute;z-index:251701248;visibility:visible;mso-wrap-style:square;mso-width-percent:0;mso-height-percent:0;mso-wrap-distance-left:9pt;mso-wrap-distance-top:0;mso-wrap-distance-right:9pt;mso-wrap-distance-bottom:0;mso-position-horizontal:absolute;mso-position-horizontal-relative:text;mso-position-vertical:absolute;mso-position-vertical-relative:page;mso-width-percent:0;mso-height-percent:0;mso-width-relative:margin;mso-height-relative:margin" from=".7pt,512.15pt" to="448.15pt,512.15pt" o:gfxdata="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" strokecolor="black [3200]" strokeweight="1pt">
                 <v:stroke joinstyle="miter"/>
                 <w10:wrap anchory="page"/>
               </v:line>
@@ -2791,7 +2787,8 @@
     </w:p>
     <w:sectPr>
       <w:headerReference w:type="default" r:id="rId7"/>
-      <w:pgSz w:w="12240" w:h="15840"/>
+      <w:footerReference w:type="default" r:id="rId8"/>
+      <w:pgSz w:w="11906" w:h="16838" w:code="9"/>
       <w:pgMar w:top="1440" w:right="1440" w:bottom="1440" w:left="1440" w:header="720" w:footer="720" w:gutter="0"/>
       <w:cols w:space="720"/>
       <w:docGrid w:linePitch="360"/>
@@ -2823,6 +2820,62 @@
     </w:p>
   </w:endnote>
 </w:endnotes>
+</file>
+
+<file path=word/footer1.xml><?xml version="1.0" encoding="utf-8"?>
+<w:ftr xmlns:wpc="http://schemas.microsoft.com/office/word/2010/wordprocessingCanvas" xmlns:cx="http://schemas.microsoft.com/office/drawing/2014/chartex" xmlns:cx1="http://schemas.microsoft.com/office/drawing/2015/9/8/chartex" xmlns:cx2="http://schemas.microsoft.com/office/drawing/2015/10/21/chartex" xmlns:cx3="http://schemas.microsoft.com/office/drawing/2016/5/9/chartex" xmlns:cx4="http://schemas.microsoft.com/office/drawing/2016/5/10/chartex" xmlns:cx5="http://schemas.microsoft.com/office/drawing/2016/5/11/chartex" xmlns:cx6="http://schemas.microsoft.com/office/drawing/2016/5/12/chartex" xmlns:cx7="http://schemas.microsoft.com/office/drawing/2016/5/13/chartex" xmlns:cx8="http://schemas.microsoft.com/office/drawing/2016/5/14/chartex" xmlns:mc="http://schemas.openxmlformats.org/markup-compatibility/2006" xmlns:aink="http://schemas.microsoft.com/office/drawing/2016/ink" xmlns:am3d="http://schemas.microsoft.com/office/drawing/2017/model3d" xmlns:o="urn:schemas-microsoft-com:office:office" xmlns:oel="http://schemas.microsoft.com/office/2019/extlst" xmlns:r="http://schemas.openxmlformats.org/officeDocument/2006/relationships" xmlns:m="http://schemas.openxmlformats.org/officeDocument/2006/math" xmlns:v="urn:schemas-microsoft-com:vml" xmlns:wp14="http://schemas.microsoft.com/office/word/2010/wordprocessingDrawing" xmlns:wp="http://schemas.openxmlformats.org/drawingml/2006/wordprocessingDrawing" xmlns:w10="urn:schemas-microsoft-com:office:word" xmlns:w="http://schemas.openxmlformats.org/wordprocessingml/2006/main" xmlns:w14="http://schemas.microsoft.com/office/word/2010/wordml" xmlns:w15="http://schemas.microsoft.com/office/word/2012/wordml" xmlns:w16cex="http://schemas.microsoft.com/office/word/2018/wordml/cex" xmlns:w16cid="http://schemas.microsoft.com/office/word/2016/wordml/cid" xmlns:w16="http://schemas.microsoft.com/office/word/2018/wordml" xmlns:w16du="http://schemas.microsoft.com/office/word/2023/wordml/word16du" xmlns:w16sdtdh="http://schemas.microsoft.com/office/word/2020/wordml/sdtdatahash" xmlns:w16sdtfl="http://schemas.microsoft.com/office/word/2024/wordml/sdtformatlock" xmlns:w16se="http://schemas.microsoft.com/office/word/2015/wordml/symex" xmlns:wpg="http://schemas.microsoft.com/office/word/2010/wordprocessingGroup" xmlns:wpi="http://schemas.microsoft.com/office/word/2010/wordprocessingInk" xmlns:wne="http://schemas.microsoft.com/office/word/2006/wordml" xmlns:wps="http://schemas.microsoft.com/office/word/2010/wordprocessingShape" mc:Ignorable="w14 w15 w16se w16cid w16 w16cex w16sdtdh w16sdtfl w16du wp14">
+  <w:p>
+    <w:pPr>
+      <w:pStyle w:val="Footer"/>
+    </w:pPr>
+    <w:r>
+      <w:rPr>
+        <w:noProof/>
+      </w:rPr>
+      <w:drawing>
+        <wp:anchor distT="0" distB="0" distL="0" distR="0" simplePos="0" relativeHeight="251662336" behindDoc="1" locked="0" layoutInCell="1" allowOverlap="1" wp14:anchorId="46F5E52A" wp14:editId="51FA4CAA">
+          <wp:simplePos x="0" y="0"/>
+          <wp:positionH relativeFrom="page">
+            <wp:posOffset>601980</wp:posOffset>
+          </wp:positionH>
+          <wp:positionV relativeFrom="page">
+            <wp:posOffset>9872345</wp:posOffset>
+          </wp:positionV>
+          <wp:extent cx="6619240" cy="370205"/>
+          <wp:effectExtent l="0" t="0" r="0" b="0"/>
+          <wp:wrapNone/>
+          <wp:docPr id="1576182265" name="Picture 1576182265"/>
+          <wp:cNvGraphicFramePr/>
+          <a:graphic xmlns:a="http://schemas.openxmlformats.org/drawingml/2006/main">
+            <a:graphicData uri="http://schemas.openxmlformats.org/drawingml/2006/picture">
+              <pic:pic xmlns:pic="http://schemas.openxmlformats.org/drawingml/2006/picture">
+                <pic:nvPicPr>
+                  <pic:cNvPr id="1576182265" name="Picture 1576182265"/>
+                  <pic:cNvPicPr/>
+                </pic:nvPicPr>
+                <pic:blipFill>
+                  <a:blip r:embed="rId1" cstate="print"/>
+                  <a:stretch>
+                    <a:fillRect/>
+                  </a:stretch>
+                </pic:blipFill>
+                <pic:spPr>
+                  <a:xfrm>
+                    <a:off x="0" y="0"/>
+                    <a:ext cx="6619240" cy="370205"/>
+                  </a:xfrm>
+                  <a:prstGeom prst="rect">
+                    <a:avLst/>
+                  </a:prstGeom>
+                </pic:spPr>
+              </pic:pic>
+            </a:graphicData>
+          </a:graphic>
+        </wp:anchor>
+      </w:drawing>
+    </w:r>
+  </w:p>
+</w:ftr>
 </file>
 
 <file path=word/footnotes.xml><?xml version="1.0" encoding="utf-8"?>
@@ -2871,13 +2924,13 @@
       <mc:AlternateContent>
         <mc:Choice Requires="wps">
           <w:drawing>
-            <wp:anchor distT="0" distB="0" distL="114300" distR="114300" simplePos="0" relativeHeight="251659264" behindDoc="0" locked="0" layoutInCell="1" allowOverlap="1" wp14:anchorId="6C1048FA" wp14:editId="0586E446">
+            <wp:anchor distT="0" distB="0" distL="114300" distR="114300" simplePos="0" relativeHeight="251659264" behindDoc="1" locked="0" layoutInCell="1" allowOverlap="1" wp14:anchorId="6C1048FA" wp14:editId="3F7DAE7B">
               <wp:simplePos x="0" y="0"/>
               <wp:positionH relativeFrom="column">
-                <wp:posOffset>730885</wp:posOffset>
+                <wp:posOffset>733245</wp:posOffset>
               </wp:positionH>
               <wp:positionV relativeFrom="paragraph">
-                <wp:posOffset>-3175</wp:posOffset>
+                <wp:posOffset>0</wp:posOffset>
               </wp:positionV>
               <wp:extent cx="2592070" cy="667385"/>
               <wp:effectExtent l="0" t="0" r="0" b="0"/>
@@ -2999,7 +3052,7 @@
               <v:stroke joinstyle="miter"/>
               <v:path gradientshapeok="t" o:connecttype="rect"/>
             </v:shapetype>
-            <v:shape id=" 15" o:spid="_x0000_s1028" type="#_x0000_t202" style="position:absolute;left:0;text-align:left;margin-left:57.55pt;margin-top:-.25pt;width:204.1pt;height:52.55pt;z-index:251659264;visibility:visible;mso-wrap-style:square;mso-width-percent:0;mso-height-percent:0;mso-wrap-distance-left:9pt;mso-wrap-distance-top:0;mso-wrap-distance-right:9pt;mso-wrap-distance-bottom:0;mso-position-horizontal:absolute;mso-position-horizontal-relative:text;mso-position-vertical:absolute;mso-position-vertical-relative:text;mso-width-percent:0;mso-height-percent:0;mso-width-relative:page;mso-height-relative:page;v-text-anchor:top" o:gfxdata="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" stroked="f">
+            <v:shape id=" 15" o:spid="_x0000_s1028" type="#_x0000_t202" style="position:absolute;left:0;text-align:left;margin-left:57.75pt;margin-top:0;width:204.1pt;height:52.55pt;z-index:-251657216;visibility:visible;mso-wrap-style:square;mso-width-percent:0;mso-height-percent:0;mso-wrap-distance-left:9pt;mso-wrap-distance-top:0;mso-wrap-distance-right:9pt;mso-wrap-distance-bottom:0;mso-position-horizontal:absolute;mso-position-horizontal-relative:text;mso-position-vertical:absolute;mso-position-vertical-relative:text;mso-width-percent:0;mso-height-percent:0;mso-width-relative:page;mso-height-relative:page;v-text-anchor:top" o:gfxdata="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" stroked="f">
               <v:path arrowok="t"/>
               <v:textbox>
                 <w:txbxContent>
@@ -4502,6 +4555,7 @@
   <w:style w:type="character" w:default="1" w:styleId="DefaultParagraphFont">
     <w:name w:val="Default Paragraph Font"/>
     <w:uiPriority w:val="1"/>
+    <w:semiHidden/>
     <w:unhideWhenUsed/>
   </w:style>
   <w:style w:type="table" w:default="1" w:styleId="TableNormal">

</xml_diff>